<commit_message>
update jurnal untuk modul2 instalasi xinu
</commit_message>
<xml_diff>
--- a/02_Instalasi_Xinu/Jurnal/Modul2_Jurnal_231110424_TsaqifHisyamSaputra.docx
+++ b/02_Instalasi_Xinu/Jurnal/Modul2_Jurnal_231110424_TsaqifHisyamSaputra.docx
@@ -232,7 +232,6 @@
         </w:rPr>
         <w:t>Tsaqif Hisyam Saputra</w:t>
       </w:r>
-      <w:proofErr w:type="gramStart"/>
       <w:r>
         <w:rPr>
           <w:rFonts w:ascii="Times New Roman" w:hAnsi="Times New Roman" w:cs="Times New Roman"/>
@@ -252,7 +251,6 @@
         <w:tab/>
         <w:t>(</w:t>
       </w:r>
-      <w:proofErr w:type="gramEnd"/>
       <w:r>
         <w:rPr>
           <w:rFonts w:ascii="Times New Roman" w:hAnsi="Times New Roman" w:cs="Times New Roman"/>
@@ -433,7 +431,7 @@
           <w:b/>
           <w:bCs/>
         </w:rPr>
-        <w:t>Persiapan dan Import Appliance</w:t>
+        <w:t>Instalasi Xinu</w:t>
       </w:r>
     </w:p>
     <w:p>
@@ -441,22 +439,17 @@
         <w:pStyle w:val="ListParagraph"/>
         <w:rPr>
           <w:rFonts w:ascii="Times New Roman" w:hAnsi="Times New Roman" w:cs="Times New Roman"/>
-          <w:b/>
-          <w:bCs/>
-        </w:rPr>
-      </w:pPr>
-      <w:r>
-        <w:rPr>
-          <w:rFonts w:ascii="Times New Roman" w:hAnsi="Times New Roman" w:cs="Times New Roman"/>
-          <w:b/>
-          <w:bCs/>
+        </w:rPr>
+      </w:pPr>
+      <w:r>
+        <w:rPr>
           <w:noProof/>
         </w:rPr>
         <w:drawing>
-          <wp:inline distT="0" distB="0" distL="0" distR="0" wp14:anchorId="2952EF57" wp14:editId="2A685A0C">
-            <wp:extent cx="2267991" cy="2067692"/>
-            <wp:effectExtent l="0" t="0" r="0" b="8890"/>
-            <wp:docPr id="1819457848" name="Picture 1"/>
+          <wp:inline distT="0" distB="0" distL="0" distR="0" wp14:anchorId="588B04D6" wp14:editId="23E72A0A">
+            <wp:extent cx="4745181" cy="2957282"/>
+            <wp:effectExtent l="0" t="0" r="0" b="0"/>
+            <wp:docPr id="970496290" name="Picture 1"/>
             <wp:cNvGraphicFramePr>
               <a:graphicFrameLocks xmlns:a="http://schemas.openxmlformats.org/drawingml/2006/main" noChangeAspect="1"/>
             </wp:cNvGraphicFramePr>
@@ -485,7 +478,7 @@
                   <pic:spPr bwMode="auto">
                     <a:xfrm>
                       <a:off x="0" y="0"/>
-                      <a:ext cx="2279050" cy="2077774"/>
+                      <a:ext cx="4750697" cy="2960719"/>
                     </a:xfrm>
                     <a:prstGeom prst="rect">
                       <a:avLst/>
@@ -501,18 +494,23 @@
           </wp:inline>
         </w:drawing>
       </w:r>
-      <w:r>
-        <w:rPr>
-          <w:rFonts w:ascii="Times New Roman" w:hAnsi="Times New Roman" w:cs="Times New Roman"/>
-          <w:b/>
-          <w:bCs/>
+    </w:p>
+    <w:p>
+      <w:pPr>
+        <w:pStyle w:val="ListParagraph"/>
+        <w:rPr>
+          <w:rFonts w:ascii="Times New Roman" w:hAnsi="Times New Roman" w:cs="Times New Roman"/>
+        </w:rPr>
+      </w:pPr>
+      <w:r>
+        <w:rPr>
           <w:noProof/>
         </w:rPr>
         <w:drawing>
-          <wp:inline distT="0" distB="0" distL="0" distR="0" wp14:anchorId="2F9273DF" wp14:editId="680BDE9F">
-            <wp:extent cx="2269736" cy="2063115"/>
-            <wp:effectExtent l="0" t="0" r="0" b="0"/>
-            <wp:docPr id="1591865876" name="Picture 2"/>
+          <wp:inline distT="0" distB="0" distL="0" distR="0" wp14:anchorId="7274645A" wp14:editId="30DB085F">
+            <wp:extent cx="4149436" cy="3112312"/>
+            <wp:effectExtent l="0" t="0" r="3810" b="0"/>
+            <wp:docPr id="1791379" name="Picture 4"/>
             <wp:cNvGraphicFramePr>
               <a:graphicFrameLocks xmlns:a="http://schemas.openxmlformats.org/drawingml/2006/main" noChangeAspect="1"/>
             </wp:cNvGraphicFramePr>
@@ -520,13 +518,13 @@
               <a:graphicData uri="http://schemas.openxmlformats.org/drawingml/2006/picture">
                 <pic:pic xmlns:pic="http://schemas.openxmlformats.org/drawingml/2006/picture">
                   <pic:nvPicPr>
-                    <pic:cNvPr id="0" name="Picture 2"/>
+                    <pic:cNvPr id="0" name="Picture 7"/>
                     <pic:cNvPicPr>
                       <a:picLocks noChangeAspect="1" noChangeArrowheads="1"/>
                     </pic:cNvPicPr>
                   </pic:nvPicPr>
                   <pic:blipFill>
-                    <a:blip r:embed="rId10" cstate="print">
+                    <a:blip r:embed="rId10">
                       <a:extLst>
                         <a:ext uri="{28A0092B-C50C-407E-A947-70E740481C1C}">
                           <a14:useLocalDpi xmlns:a14="http://schemas.microsoft.com/office/drawing/2010/main" val="0"/>
@@ -541,7 +539,7 @@
                   <pic:spPr bwMode="auto">
                     <a:xfrm>
                       <a:off x="0" y="0"/>
-                      <a:ext cx="2299661" cy="2090316"/>
+                      <a:ext cx="4150911" cy="3113418"/>
                     </a:xfrm>
                     <a:prstGeom prst="rect">
                       <a:avLst/>
@@ -560,90 +558,6 @@
     </w:p>
     <w:p>
       <w:pPr>
-        <w:pStyle w:val="ListParagraph"/>
-        <w:rPr>
-          <w:rFonts w:ascii="Times New Roman" w:hAnsi="Times New Roman" w:cs="Times New Roman"/>
-        </w:rPr>
-      </w:pPr>
-      <w:r>
-        <w:rPr>
-          <w:rFonts w:ascii="Times New Roman" w:hAnsi="Times New Roman" w:cs="Times New Roman"/>
-        </w:rPr>
-        <w:t xml:space="preserve">Awalnya </w:t>
-      </w:r>
-      <w:r>
-        <w:rPr>
-          <w:rFonts w:ascii="Times New Roman" w:hAnsi="Times New Roman" w:cs="Times New Roman"/>
-        </w:rPr>
-        <w:t>dimulai dengan memasukkan konfigurasi mesin virtual yang sudah</w:t>
-      </w:r>
-      <w:r>
-        <w:rPr>
-          <w:rFonts w:ascii="Times New Roman" w:hAnsi="Times New Roman" w:cs="Times New Roman"/>
-        </w:rPr>
-        <w:t xml:space="preserve"> didwonload</w:t>
-      </w:r>
-      <w:r>
-        <w:rPr>
-          <w:rFonts w:ascii="Times New Roman" w:hAnsi="Times New Roman" w:cs="Times New Roman"/>
-        </w:rPr>
-        <w:t xml:space="preserve"> ke dalam Oracle VM VirtualBox melalui fitur </w:t>
-      </w:r>
-      <w:r>
-        <w:rPr>
-          <w:rFonts w:ascii="Times New Roman" w:hAnsi="Times New Roman" w:cs="Times New Roman"/>
-          <w:b/>
-          <w:bCs/>
-        </w:rPr>
-        <w:t>Import Virtual Appliance</w:t>
-      </w:r>
-      <w:r>
-        <w:rPr>
-          <w:rFonts w:ascii="Times New Roman" w:hAnsi="Times New Roman" w:cs="Times New Roman"/>
-        </w:rPr>
-        <w:t xml:space="preserve">. </w:t>
-      </w:r>
-      <w:r>
-        <w:rPr>
-          <w:rFonts w:ascii="Times New Roman" w:hAnsi="Times New Roman" w:cs="Times New Roman"/>
-        </w:rPr>
-        <w:t>P</w:t>
-      </w:r>
-      <w:r>
-        <w:rPr>
-          <w:rFonts w:ascii="Times New Roman" w:hAnsi="Times New Roman" w:cs="Times New Roman"/>
-        </w:rPr>
-        <w:t xml:space="preserve">ada Gambar </w:t>
-      </w:r>
-      <w:r>
-        <w:rPr>
-          <w:rFonts w:ascii="Times New Roman" w:hAnsi="Times New Roman" w:cs="Times New Roman"/>
-        </w:rPr>
-        <w:t>tersebut dapat dilihat sudah diar</w:t>
-      </w:r>
-      <w:r>
-        <w:rPr>
-          <w:rFonts w:ascii="Times New Roman" w:hAnsi="Times New Roman" w:cs="Times New Roman"/>
-        </w:rPr>
-        <w:t xml:space="preserve">ahkan sumber instalasi ke sistem file lokal untuk memuat dua file utama, yaitu development-system.ova dan backend.ova. File </w:t>
-      </w:r>
-      <w:proofErr w:type="gramStart"/>
-      <w:r>
-        <w:rPr>
-          <w:rFonts w:ascii="Times New Roman" w:hAnsi="Times New Roman" w:cs="Times New Roman"/>
-        </w:rPr>
-        <w:t>berformat .ova</w:t>
-      </w:r>
-      <w:proofErr w:type="gramEnd"/>
-      <w:r>
-        <w:rPr>
-          <w:rFonts w:ascii="Times New Roman" w:hAnsi="Times New Roman" w:cs="Times New Roman"/>
-        </w:rPr>
-        <w:t xml:space="preserve"> ini sangat praktis karena di dalamnya sudah terkandung seluruh pengaturan sistem operasi, alokasi memori, hingga konfigurasi jaringan yang spesifik, sehingga Anda tidak perlu melakukan instalasi sistem operasi dari nol.</w:t>
-      </w:r>
-    </w:p>
-    <w:p>
-      <w:pPr>
         <w:rPr>
           <w:rFonts w:ascii="Times New Roman" w:hAnsi="Times New Roman" w:cs="Times New Roman"/>
           <w:b/>
@@ -679,30 +593,17 @@
           <w:bCs/>
         </w:rPr>
         <w:lastRenderedPageBreak/>
-        <w:t>Manajemen Dashboard VirtualBox</w:t>
-      </w:r>
-    </w:p>
-    <w:p>
-      <w:pPr>
-        <w:pStyle w:val="ListParagraph"/>
-        <w:rPr>
-          <w:rFonts w:ascii="Times New Roman" w:hAnsi="Times New Roman" w:cs="Times New Roman"/>
-          <w:b/>
-          <w:bCs/>
-        </w:rPr>
-      </w:pPr>
-      <w:r>
-        <w:rPr>
-          <w:rFonts w:ascii="Times New Roman" w:hAnsi="Times New Roman" w:cs="Times New Roman"/>
-          <w:b/>
-          <w:bCs/>
+        <w:t xml:space="preserve">Tampilan vm development-system </w:t>
+      </w:r>
+      <w:r>
+        <w:rPr>
           <w:noProof/>
         </w:rPr>
         <w:drawing>
-          <wp:inline distT="0" distB="0" distL="0" distR="0" wp14:anchorId="0C8F1EE1" wp14:editId="2BEAC171">
-            <wp:extent cx="3489960" cy="2184193"/>
-            <wp:effectExtent l="0" t="0" r="0" b="6985"/>
-            <wp:docPr id="474854889" name="Picture 3"/>
+          <wp:inline distT="0" distB="0" distL="0" distR="0" wp14:anchorId="1CAB0C1B" wp14:editId="788441F9">
+            <wp:extent cx="4738254" cy="3553959"/>
+            <wp:effectExtent l="0" t="0" r="5715" b="8890"/>
+            <wp:docPr id="1192878248" name="Picture 2"/>
             <wp:cNvGraphicFramePr>
               <a:graphicFrameLocks xmlns:a="http://schemas.openxmlformats.org/drawingml/2006/main" noChangeAspect="1"/>
             </wp:cNvGraphicFramePr>
@@ -716,7 +617,7 @@
                     </pic:cNvPicPr>
                   </pic:nvPicPr>
                   <pic:blipFill>
-                    <a:blip r:embed="rId11" cstate="print">
+                    <a:blip r:embed="rId11">
                       <a:extLst>
                         <a:ext uri="{28A0092B-C50C-407E-A947-70E740481C1C}">
                           <a14:useLocalDpi xmlns:a14="http://schemas.microsoft.com/office/drawing/2010/main" val="0"/>
@@ -731,7 +632,7 @@
                   <pic:spPr bwMode="auto">
                     <a:xfrm>
                       <a:off x="0" y="0"/>
-                      <a:ext cx="3494299" cy="2186909"/>
+                      <a:ext cx="4744708" cy="3558800"/>
                     </a:xfrm>
                     <a:prstGeom prst="rect">
                       <a:avLst/>
@@ -750,32 +651,6 @@
     </w:p>
     <w:p>
       <w:pPr>
-        <w:pStyle w:val="ListParagraph"/>
-        <w:rPr>
-          <w:rFonts w:ascii="Times New Roman" w:hAnsi="Times New Roman" w:cs="Times New Roman"/>
-        </w:rPr>
-      </w:pPr>
-      <w:r>
-        <w:rPr>
-          <w:rFonts w:ascii="Times New Roman" w:hAnsi="Times New Roman" w:cs="Times New Roman"/>
-        </w:rPr>
-        <w:t xml:space="preserve">Setelah proses import selesai, Gambar </w:t>
-      </w:r>
-      <w:r>
-        <w:rPr>
-          <w:rFonts w:ascii="Times New Roman" w:hAnsi="Times New Roman" w:cs="Times New Roman"/>
-        </w:rPr>
-        <w:t>di atas</w:t>
-      </w:r>
-      <w:r>
-        <w:rPr>
-          <w:rFonts w:ascii="Times New Roman" w:hAnsi="Times New Roman" w:cs="Times New Roman"/>
-        </w:rPr>
-        <w:t xml:space="preserve"> menunjukkan antarmuka VirtualBox Manager yang menampilkan daftar mesin virtual yang telah terpasang. Di sini terlihat mesin development-system berbasis Debian 64-bit yang berfungsi sebagai server pengembangan, serta mesin backend yang akan bertindak sebagai target eksekusi sistem operasi Xinu. Hal krusial yang perlu diperhatikan pada bagian ini adalah pengaturan Network, di mana kedua mesin dihubungkan melalui "Internal Network" bernama xinu_net. Jaringan privat ini memungkinkan pengiriman file kernel dari mesin pengembang ke mesin backend tanpa gangguan dari koneksi internet luar.</w:t>
-      </w:r>
-    </w:p>
-    <w:p>
-      <w:pPr>
         <w:rPr>
           <w:rFonts w:ascii="Times New Roman" w:hAnsi="Times New Roman" w:cs="Times New Roman"/>
           <w:b/>
@@ -811,7 +686,7 @@
           <w:bCs/>
         </w:rPr>
         <w:lastRenderedPageBreak/>
-        <w:t>Hasil Jadi: Lingkungan Pengembangan (Frontend)</w:t>
+        <w:t>Tampilan backend vm</w:t>
       </w:r>
     </w:p>
     <w:p>
@@ -831,10 +706,10 @@
           <w:noProof/>
         </w:rPr>
         <w:drawing>
-          <wp:inline distT="0" distB="0" distL="0" distR="0" wp14:anchorId="083CED6C" wp14:editId="5C68EA77">
-            <wp:extent cx="3718560" cy="2788920"/>
-            <wp:effectExtent l="0" t="0" r="0" b="0"/>
-            <wp:docPr id="1367391569" name="Picture 4"/>
+          <wp:inline distT="0" distB="0" distL="0" distR="0" wp14:anchorId="43E2ACF8" wp14:editId="4515484A">
+            <wp:extent cx="4862945" cy="2701636"/>
+            <wp:effectExtent l="0" t="0" r="0" b="3810"/>
+            <wp:docPr id="798526963" name="Picture 5"/>
             <wp:cNvGraphicFramePr>
               <a:graphicFrameLocks xmlns:a="http://schemas.openxmlformats.org/drawingml/2006/main" noChangeAspect="1"/>
             </wp:cNvGraphicFramePr>
@@ -842,7 +717,7 @@
               <a:graphicData uri="http://schemas.openxmlformats.org/drawingml/2006/picture">
                 <pic:pic xmlns:pic="http://schemas.openxmlformats.org/drawingml/2006/picture">
                   <pic:nvPicPr>
-                    <pic:cNvPr id="0" name="Picture 4"/>
+                    <pic:cNvPr id="0" name="Picture 5"/>
                     <pic:cNvPicPr>
                       <a:picLocks noChangeAspect="1" noChangeArrowheads="1"/>
                     </pic:cNvPicPr>
@@ -863,7 +738,7 @@
                   <pic:spPr bwMode="auto">
                     <a:xfrm>
                       <a:off x="0" y="0"/>
-                      <a:ext cx="3718560" cy="2788920"/>
+                      <a:ext cx="4884874" cy="2713819"/>
                     </a:xfrm>
                     <a:prstGeom prst="rect">
                       <a:avLst/>
@@ -883,50 +758,6 @@
     <w:p>
       <w:pPr>
         <w:pStyle w:val="ListParagraph"/>
-        <w:rPr>
-          <w:rFonts w:ascii="Times New Roman" w:hAnsi="Times New Roman" w:cs="Times New Roman"/>
-        </w:rPr>
-      </w:pPr>
-      <w:r>
-        <w:rPr>
-          <w:rFonts w:ascii="Times New Roman" w:hAnsi="Times New Roman" w:cs="Times New Roman"/>
-        </w:rPr>
-        <w:t xml:space="preserve">Di atas itu </w:t>
-      </w:r>
-      <w:r>
-        <w:rPr>
-          <w:rFonts w:ascii="Times New Roman" w:hAnsi="Times New Roman" w:cs="Times New Roman"/>
-        </w:rPr>
-        <w:t>hasil jadi dari sisi Frontend atau lingkungan kerja pengembang. Terminal nunjukk</w:t>
-      </w:r>
-      <w:r>
-        <w:rPr>
-          <w:rFonts w:ascii="Times New Roman" w:hAnsi="Times New Roman" w:cs="Times New Roman"/>
-        </w:rPr>
-        <w:t>i</w:t>
-      </w:r>
-      <w:r>
-        <w:rPr>
-          <w:rFonts w:ascii="Times New Roman" w:hAnsi="Times New Roman" w:cs="Times New Roman"/>
-        </w:rPr>
-        <w:t>n user xinu</w:t>
-      </w:r>
-      <w:r>
-        <w:rPr>
-          <w:rFonts w:ascii="Times New Roman" w:hAnsi="Times New Roman" w:cs="Times New Roman"/>
-        </w:rPr>
-        <w:t xml:space="preserve"> udah</w:t>
-      </w:r>
-      <w:r>
-        <w:rPr>
-          <w:rFonts w:ascii="Times New Roman" w:hAnsi="Times New Roman" w:cs="Times New Roman"/>
-        </w:rPr>
-        <w:t xml:space="preserve"> login ke dalam sistem xinu-develop-end, yang merupakan mesin Linux lengkap dengan perangkat kompilasi seperti gcc dan make. Di sinilah aktivitas utama dilakukan, mulai dari memodifikasi kode sumber (source code) sistem operasi Xinu menggunakan teks editor, hingga melakukan proses kompilasi untuk menghasilkan file binary atau kernel Xinu yang siap untuk diuji coba pada mesin target.</w:t>
-      </w:r>
-    </w:p>
-    <w:p>
-      <w:pPr>
-        <w:pStyle w:val="ListParagraph"/>
         <w:numPr>
           <w:ilvl w:val="0"/>
           <w:numId w:val="9"/>
@@ -943,20 +774,33 @@
           <w:b/>
           <w:bCs/>
         </w:rPr>
-        <w:t>Hasil Jadi: Menjalankan Xinu (Backend)</w:t>
-      </w:r>
-      <w:r>
-        <w:rPr>
-          <w:rFonts w:ascii="Times New Roman" w:hAnsi="Times New Roman" w:cs="Times New Roman"/>
-          <w:b/>
-          <w:bCs/>
+        <w:t>Test koneksi</w:t>
+      </w:r>
+      <w:r>
+        <w:rPr>
+          <w:rFonts w:ascii="Times New Roman" w:hAnsi="Times New Roman" w:cs="Times New Roman"/>
+          <w:b/>
+          <w:bCs/>
+        </w:rPr>
+        <w:t xml:space="preserve"> </w:t>
+      </w:r>
+    </w:p>
+    <w:p>
+      <w:pPr>
+        <w:pStyle w:val="ListParagraph"/>
+        <w:rPr>
+          <w:rFonts w:ascii="Times New Roman" w:hAnsi="Times New Roman" w:cs="Times New Roman"/>
+        </w:rPr>
+      </w:pPr>
+      <w:r>
+        <w:rPr>
           <w:noProof/>
         </w:rPr>
         <w:drawing>
-          <wp:inline distT="0" distB="0" distL="0" distR="0" wp14:anchorId="3DD43199" wp14:editId="79F7DB56">
-            <wp:extent cx="3185160" cy="1769533"/>
-            <wp:effectExtent l="0" t="0" r="0" b="2540"/>
-            <wp:docPr id="798526963" name="Picture 5"/>
+          <wp:inline distT="0" distB="0" distL="0" distR="0" wp14:anchorId="5DB3E109" wp14:editId="2D8554CE">
+            <wp:extent cx="5612130" cy="4209415"/>
+            <wp:effectExtent l="0" t="0" r="7620" b="635"/>
+            <wp:docPr id="67109156" name="Picture 3"/>
             <wp:cNvGraphicFramePr>
               <a:graphicFrameLocks xmlns:a="http://schemas.openxmlformats.org/drawingml/2006/main" noChangeAspect="1"/>
             </wp:cNvGraphicFramePr>
@@ -985,7 +829,7 @@
                   <pic:spPr bwMode="auto">
                     <a:xfrm>
                       <a:off x="0" y="0"/>
-                      <a:ext cx="3193420" cy="1774122"/>
+                      <a:ext cx="5612130" cy="4209415"/>
                     </a:xfrm>
                     <a:prstGeom prst="rect">
                       <a:avLst/>
@@ -1004,45 +848,494 @@
     </w:p>
     <w:p>
       <w:pPr>
+        <w:rPr>
+          <w:rFonts w:ascii="Times New Roman" w:hAnsi="Times New Roman" w:cs="Times New Roman"/>
+        </w:rPr>
+      </w:pPr>
+      <w:r>
+        <w:rPr>
+          <w:rFonts w:ascii="Times New Roman" w:hAnsi="Times New Roman" w:cs="Times New Roman"/>
+        </w:rPr>
+        <w:br w:type="page"/>
+      </w:r>
+    </w:p>
+    <w:p>
+      <w:pPr>
         <w:pStyle w:val="ListParagraph"/>
-        <w:rPr>
-          <w:rFonts w:ascii="Times New Roman" w:hAnsi="Times New Roman" w:cs="Times New Roman"/>
-        </w:rPr>
-      </w:pPr>
-      <w:r>
-        <w:rPr>
-          <w:rFonts w:ascii="Times New Roman" w:hAnsi="Times New Roman" w:cs="Times New Roman"/>
-        </w:rPr>
-        <w:t>Karena mesin ini tidak memiliki sistem operasi lokal di hard disk-nya, ia menggunakan protokol iPXE untuk melakukan booting melalui jaringan (</w:t>
+        <w:numPr>
+          <w:ilvl w:val="0"/>
+          <w:numId w:val="9"/>
+        </w:numPr>
+        <w:rPr>
+          <w:rFonts w:ascii="Times New Roman" w:hAnsi="Times New Roman" w:cs="Times New Roman"/>
+          <w:lang w:val="en-ID"/>
+        </w:rPr>
+      </w:pPr>
+      <w:r>
+        <w:rPr>
+          <w:rFonts w:ascii="Times New Roman" w:hAnsi="Times New Roman" w:cs="Times New Roman"/>
+          <w:b/>
+          <w:bCs/>
+          <w:lang w:val="en-ID"/>
+        </w:rPr>
+        <w:lastRenderedPageBreak/>
+        <w:t>a. Xinu OS digunakan pada sistem embedded?</w:t>
+      </w:r>
+      <w:r>
+        <w:rPr>
+          <w:rFonts w:ascii="Times New Roman" w:hAnsi="Times New Roman" w:cs="Times New Roman"/>
+          <w:lang w:val="en-ID"/>
+        </w:rPr>
+        <w:t xml:space="preserve"> </w:t>
+      </w:r>
+      <w:r>
+        <w:rPr>
+          <w:rFonts w:ascii="Times New Roman" w:hAnsi="Times New Roman" w:cs="Times New Roman"/>
+          <w:lang w:val="en-ID"/>
+        </w:rPr>
+        <w:br/>
+      </w:r>
+      <w:r>
+        <w:rPr>
+          <w:rFonts w:ascii="Times New Roman" w:hAnsi="Times New Roman" w:cs="Times New Roman"/>
+          <w:lang w:val="en-ID"/>
+        </w:rPr>
+        <w:t>Benar</w:t>
+      </w:r>
+      <w:r>
+        <w:rPr>
+          <w:rFonts w:ascii="Times New Roman" w:hAnsi="Times New Roman" w:cs="Times New Roman"/>
+          <w:lang w:val="en-ID"/>
+        </w:rPr>
+        <w:t>,</w:t>
+      </w:r>
+      <w:r>
+        <w:rPr>
+          <w:rFonts w:ascii="Times New Roman" w:hAnsi="Times New Roman" w:cs="Times New Roman"/>
+          <w:lang w:val="en-ID"/>
+        </w:rPr>
+        <w:t xml:space="preserve"> Xinu</w:t>
+      </w:r>
+      <w:r>
+        <w:rPr>
+          <w:rFonts w:ascii="Times New Roman" w:hAnsi="Times New Roman" w:cs="Times New Roman"/>
+          <w:lang w:val="en-ID"/>
+        </w:rPr>
+        <w:t xml:space="preserve"> </w:t>
+      </w:r>
+      <w:r>
+        <w:rPr>
+          <w:rFonts w:ascii="Times New Roman" w:hAnsi="Times New Roman" w:cs="Times New Roman"/>
+          <w:lang w:val="en-ID"/>
+        </w:rPr>
+        <w:t>adalah sistem operasi yang didesain khusus untuk tujuan pendidikan dan penelitian dalam pengembangan sistem embedded serta jaringan karena arsitekturnya yang ringan dan efisien.</w:t>
+      </w:r>
+    </w:p>
+    <w:p>
+      <w:pPr>
+        <w:pStyle w:val="ListParagraph"/>
+        <w:rPr>
+          <w:rFonts w:ascii="Times New Roman" w:hAnsi="Times New Roman" w:cs="Times New Roman"/>
+          <w:lang w:val="en-ID"/>
+        </w:rPr>
+      </w:pPr>
+      <w:r>
+        <w:rPr>
+          <w:rFonts w:ascii="Times New Roman" w:hAnsi="Times New Roman" w:cs="Times New Roman"/>
+          <w:b/>
+          <w:bCs/>
+          <w:lang w:val="en-ID"/>
+        </w:rPr>
+        <w:t>b. Sebutkan 2 VM yang digunakan pada lab ini!</w:t>
+      </w:r>
+      <w:r>
+        <w:rPr>
+          <w:rFonts w:ascii="Times New Roman" w:hAnsi="Times New Roman" w:cs="Times New Roman"/>
+          <w:lang w:val="en-ID"/>
+        </w:rPr>
+        <w:t xml:space="preserve"> </w:t>
+      </w:r>
+      <w:r>
+        <w:rPr>
+          <w:rFonts w:ascii="Times New Roman" w:hAnsi="Times New Roman" w:cs="Times New Roman"/>
+          <w:lang w:val="en-ID"/>
+        </w:rPr>
+        <w:br/>
+      </w:r>
+      <w:r>
+        <w:rPr>
+          <w:rFonts w:ascii="Times New Roman" w:hAnsi="Times New Roman" w:cs="Times New Roman"/>
+          <w:lang w:val="en-ID"/>
+        </w:rPr>
+        <w:t>2311104024_development-system, 2311104024_backend</w:t>
+      </w:r>
+    </w:p>
+    <w:p>
+      <w:pPr>
+        <w:pStyle w:val="ListParagraph"/>
+        <w:rPr>
+          <w:rFonts w:ascii="Times New Roman" w:hAnsi="Times New Roman" w:cs="Times New Roman"/>
+          <w:lang w:val="en-ID"/>
+        </w:rPr>
+      </w:pPr>
+      <w:r>
+        <w:rPr>
+          <w:rFonts w:ascii="Times New Roman" w:hAnsi="Times New Roman" w:cs="Times New Roman"/>
+          <w:b/>
+          <w:bCs/>
+          <w:lang w:val="en-ID"/>
+        </w:rPr>
+        <w:t>c. VM apa yang menghasilkan Xinu Image?</w:t>
+      </w:r>
+      <w:r>
+        <w:rPr>
+          <w:rFonts w:ascii="Times New Roman" w:hAnsi="Times New Roman" w:cs="Times New Roman"/>
+          <w:lang w:val="en-ID"/>
+        </w:rPr>
+        <w:t xml:space="preserve"> </w:t>
+      </w:r>
+      <w:r>
+        <w:rPr>
+          <w:rFonts w:ascii="Times New Roman" w:hAnsi="Times New Roman" w:cs="Times New Roman"/>
+          <w:lang w:val="en-ID"/>
+        </w:rPr>
+        <w:br/>
+        <w:t>231110240_</w:t>
+      </w:r>
+      <w:r>
+        <w:rPr>
+          <w:rFonts w:ascii="Times New Roman" w:hAnsi="Times New Roman" w:cs="Times New Roman"/>
+          <w:lang w:val="en-ID"/>
+        </w:rPr>
+        <w:t>development-system</w:t>
+      </w:r>
+      <w:r>
+        <w:rPr>
+          <w:rFonts w:ascii="Times New Roman" w:hAnsi="Times New Roman" w:cs="Times New Roman"/>
+          <w:lang w:val="en-ID"/>
+        </w:rPr>
+        <w:t xml:space="preserve"> adalah</w:t>
+      </w:r>
+      <w:r>
+        <w:rPr>
+          <w:rFonts w:ascii="Times New Roman" w:hAnsi="Times New Roman" w:cs="Times New Roman"/>
+          <w:lang w:val="en-ID"/>
+        </w:rPr>
+        <w:t xml:space="preserve"> pengembang </w:t>
+      </w:r>
+      <w:r>
+        <w:rPr>
+          <w:rFonts w:ascii="Times New Roman" w:hAnsi="Times New Roman" w:cs="Times New Roman"/>
+          <w:lang w:val="en-ID"/>
+        </w:rPr>
+        <w:t xml:space="preserve">yang </w:t>
+      </w:r>
+      <w:r>
+        <w:rPr>
+          <w:rFonts w:ascii="Times New Roman" w:hAnsi="Times New Roman" w:cs="Times New Roman"/>
+          <w:lang w:val="en-ID"/>
+        </w:rPr>
+        <w:t>melakukan kompilasi kode sumber menggunakan perintah make untuk menciptakan file kernel/image yang nantinya dikirim ke backend.</w:t>
+      </w:r>
+    </w:p>
+    <w:p>
+      <w:pPr>
+        <w:pStyle w:val="ListParagraph"/>
+        <w:rPr>
+          <w:rFonts w:ascii="Times New Roman" w:hAnsi="Times New Roman" w:cs="Times New Roman"/>
+          <w:lang w:val="en-ID"/>
+        </w:rPr>
+      </w:pPr>
+      <w:r>
+        <w:rPr>
+          <w:rFonts w:ascii="Times New Roman" w:hAnsi="Times New Roman" w:cs="Times New Roman"/>
+          <w:b/>
+          <w:bCs/>
+          <w:lang w:val="en-ID"/>
+        </w:rPr>
+        <w:t>d. VM apa yang menjalankan OS Xinu?</w:t>
+      </w:r>
+      <w:r>
+        <w:rPr>
+          <w:rFonts w:ascii="Times New Roman" w:hAnsi="Times New Roman" w:cs="Times New Roman"/>
+          <w:lang w:val="en-ID"/>
+        </w:rPr>
+        <w:t xml:space="preserve"> </w:t>
+      </w:r>
+      <w:r>
+        <w:rPr>
+          <w:rFonts w:ascii="Times New Roman" w:hAnsi="Times New Roman" w:cs="Times New Roman"/>
+          <w:lang w:val="en-ID"/>
+        </w:rPr>
+        <w:br/>
+      </w:r>
+      <w:r>
+        <w:rPr>
+          <w:rFonts w:ascii="Times New Roman" w:hAnsi="Times New Roman" w:cs="Times New Roman"/>
+          <w:lang w:val="en-ID"/>
+        </w:rPr>
+        <w:t xml:space="preserve">VM yang menjalankan OS Xinu adalah </w:t>
+      </w:r>
+      <w:r>
+        <w:rPr>
+          <w:rFonts w:ascii="Times New Roman" w:hAnsi="Times New Roman" w:cs="Times New Roman"/>
+          <w:b/>
+          <w:bCs/>
+          <w:lang w:val="en-ID"/>
+        </w:rPr>
+        <w:t>backend</w:t>
+      </w:r>
+      <w:r>
+        <w:rPr>
+          <w:rFonts w:ascii="Times New Roman" w:hAnsi="Times New Roman" w:cs="Times New Roman"/>
+          <w:lang w:val="en-ID"/>
+        </w:rPr>
+        <w:t xml:space="preserve">. </w:t>
+      </w:r>
+      <w:r>
+        <w:rPr>
+          <w:rFonts w:ascii="Times New Roman" w:hAnsi="Times New Roman" w:cs="Times New Roman"/>
+          <w:lang w:val="en-ID"/>
+        </w:rPr>
+        <w:t>M</w:t>
+      </w:r>
+      <w:r>
+        <w:rPr>
+          <w:rFonts w:ascii="Times New Roman" w:hAnsi="Times New Roman" w:cs="Times New Roman"/>
+          <w:lang w:val="en-ID"/>
+        </w:rPr>
+        <w:t>esin ini melakukan proses booting untuk memuat dan mengeksekusi kernel Xinu yang diterima melalui jaringan.</w:t>
+      </w:r>
+    </w:p>
+    <w:p>
+      <w:pPr>
+        <w:pStyle w:val="ListParagraph"/>
+        <w:rPr>
+          <w:rFonts w:ascii="Times New Roman" w:hAnsi="Times New Roman" w:cs="Times New Roman"/>
+          <w:lang w:val="en-ID"/>
+        </w:rPr>
+      </w:pPr>
+      <w:r>
+        <w:rPr>
+          <w:rFonts w:ascii="Times New Roman" w:hAnsi="Times New Roman" w:cs="Times New Roman"/>
+          <w:b/>
+          <w:bCs/>
+          <w:lang w:val="en-ID"/>
+        </w:rPr>
+        <w:t>e. Sebutkan 2 nama jaringan yang ada pada arsitektur!</w:t>
+      </w:r>
+      <w:r>
+        <w:rPr>
+          <w:rFonts w:ascii="Times New Roman" w:hAnsi="Times New Roman" w:cs="Times New Roman"/>
+          <w:lang w:val="en-ID"/>
+        </w:rPr>
+        <w:t xml:space="preserve"> </w:t>
+      </w:r>
+      <w:r>
+        <w:rPr>
+          <w:rFonts w:ascii="Times New Roman" w:hAnsi="Times New Roman" w:cs="Times New Roman"/>
+          <w:lang w:val="en-ID"/>
+        </w:rPr>
+        <w:br/>
+      </w:r>
+      <w:r>
+        <w:rPr>
+          <w:rFonts w:ascii="Times New Roman" w:hAnsi="Times New Roman" w:cs="Times New Roman"/>
+          <w:b/>
+          <w:bCs/>
+          <w:lang w:val="en-ID"/>
+        </w:rPr>
+        <w:t>Internal Network</w:t>
+      </w:r>
+      <w:r>
+        <w:rPr>
+          <w:rFonts w:ascii="Times New Roman" w:hAnsi="Times New Roman" w:cs="Times New Roman"/>
+          <w:lang w:val="en-ID"/>
+        </w:rPr>
+        <w:t xml:space="preserve"> (dengan nama spesifik xinu_net) yang menghubungkan kedua VM, dan </w:t>
+      </w:r>
+      <w:r>
+        <w:rPr>
+          <w:rFonts w:ascii="Times New Roman" w:hAnsi="Times New Roman" w:cs="Times New Roman"/>
+          <w:b/>
+          <w:bCs/>
+          <w:lang w:val="en-ID"/>
+        </w:rPr>
+        <w:t>NAT</w:t>
+      </w:r>
+      <w:r>
+        <w:rPr>
+          <w:rFonts w:ascii="Times New Roman" w:hAnsi="Times New Roman" w:cs="Times New Roman"/>
+          <w:lang w:val="en-ID"/>
+        </w:rPr>
+        <w:t xml:space="preserve"> yang digunakan oleh mesin development untuk mendapatkan akses internet ke host asli.</w:t>
+      </w:r>
+    </w:p>
+    <w:p>
+      <w:pPr>
+        <w:pStyle w:val="ListParagraph"/>
+        <w:rPr>
+          <w:rFonts w:ascii="Times New Roman" w:hAnsi="Times New Roman" w:cs="Times New Roman"/>
+          <w:lang w:val="en-ID"/>
+        </w:rPr>
+      </w:pPr>
+      <w:r>
+        <w:rPr>
+          <w:rFonts w:ascii="Times New Roman" w:hAnsi="Times New Roman" w:cs="Times New Roman"/>
+          <w:b/>
+          <w:bCs/>
+          <w:lang w:val="en-ID"/>
+        </w:rPr>
+        <w:t>f. Pada VM apa DHCP server dan TFTP server berada?</w:t>
+      </w:r>
+      <w:r>
+        <w:rPr>
+          <w:rFonts w:ascii="Times New Roman" w:hAnsi="Times New Roman" w:cs="Times New Roman"/>
+          <w:lang w:val="en-ID"/>
+        </w:rPr>
+        <w:t xml:space="preserve"> </w:t>
+      </w:r>
+      <w:r>
+        <w:rPr>
+          <w:rFonts w:ascii="Times New Roman" w:hAnsi="Times New Roman" w:cs="Times New Roman"/>
+          <w:lang w:val="en-ID"/>
+        </w:rPr>
+        <w:br/>
+      </w:r>
+      <w:r>
+        <w:rPr>
+          <w:rFonts w:ascii="Times New Roman" w:hAnsi="Times New Roman" w:cs="Times New Roman"/>
+          <w:lang w:val="en-ID"/>
+        </w:rPr>
+        <w:t xml:space="preserve">DHCP server dan TFTP server berada pada VM </w:t>
+      </w:r>
+      <w:r>
+        <w:rPr>
+          <w:rFonts w:ascii="Times New Roman" w:hAnsi="Times New Roman" w:cs="Times New Roman"/>
+          <w:b/>
+          <w:bCs/>
+          <w:lang w:val="en-ID"/>
+        </w:rPr>
+        <w:t>development-system</w:t>
+      </w:r>
+      <w:r>
+        <w:rPr>
+          <w:rFonts w:ascii="Times New Roman" w:hAnsi="Times New Roman" w:cs="Times New Roman"/>
+          <w:lang w:val="en-ID"/>
+        </w:rPr>
+        <w:t xml:space="preserve">. Mesin ini bertugas memberikan alamat IP kepada mesin backend (via DHCP) dan menyediakan file bootloader atau kernel (via TFTP) agar mesin backend bisa melakukan </w:t>
       </w:r>
       <w:r>
         <w:rPr>
           <w:rFonts w:ascii="Times New Roman" w:hAnsi="Times New Roman" w:cs="Times New Roman"/>
           <w:i/>
           <w:iCs/>
-        </w:rPr>
-        <w:t>Network Boot</w:t>
-      </w:r>
-      <w:r>
-        <w:rPr>
-          <w:rFonts w:ascii="Times New Roman" w:hAnsi="Times New Roman" w:cs="Times New Roman"/>
-        </w:rPr>
-        <w:t xml:space="preserve">). Mesin backend akan meminta alamat IP via DHCP (terlihat mendapat IP 192.168.201.114), kemudian mengunduh file bootloader </w:t>
-      </w:r>
-      <w:proofErr w:type="gramStart"/>
-      <w:r>
-        <w:rPr>
-          <w:rFonts w:ascii="Times New Roman" w:hAnsi="Times New Roman" w:cs="Times New Roman"/>
-        </w:rPr>
-        <w:t>xinu.grub</w:t>
-      </w:r>
-      <w:proofErr w:type="gramEnd"/>
-      <w:r>
-        <w:rPr>
-          <w:rFonts w:ascii="Times New Roman" w:hAnsi="Times New Roman" w:cs="Times New Roman"/>
-        </w:rPr>
-        <w:t xml:space="preserve"> dari mesin development melalui protokol TFTP. Munculnya pesan "Welcome to GRUB!" menandakan bahwa kernel Xinu telah berhasil diterima dan siap dieksekusi oleh mesin tersebut.</w:t>
-      </w:r>
+          <w:lang w:val="en-ID"/>
+        </w:rPr>
+        <w:t>network boot</w:t>
+      </w:r>
+      <w:r>
+        <w:rPr>
+          <w:rFonts w:ascii="Times New Roman" w:hAnsi="Times New Roman" w:cs="Times New Roman"/>
+          <w:lang w:val="en-ID"/>
+        </w:rPr>
+        <w:t>.</w:t>
+      </w:r>
+    </w:p>
+    <w:p>
+      <w:pPr>
+        <w:pStyle w:val="ListParagraph"/>
+        <w:rPr>
+          <w:rFonts w:ascii="Times New Roman" w:hAnsi="Times New Roman" w:cs="Times New Roman"/>
+          <w:lang w:val="en-ID"/>
+        </w:rPr>
+      </w:pPr>
+      <w:r>
+        <w:rPr>
+          <w:rFonts w:ascii="Times New Roman" w:hAnsi="Times New Roman" w:cs="Times New Roman"/>
+          <w:b/>
+          <w:bCs/>
+          <w:lang w:val="en-ID"/>
+        </w:rPr>
+        <w:t>g. Pada VM apa PXE boot berada?</w:t>
+      </w:r>
+      <w:r>
+        <w:rPr>
+          <w:rFonts w:ascii="Times New Roman" w:hAnsi="Times New Roman" w:cs="Times New Roman"/>
+          <w:lang w:val="en-ID"/>
+        </w:rPr>
+        <w:t xml:space="preserve"> </w:t>
+      </w:r>
+      <w:r>
+        <w:rPr>
+          <w:rFonts w:ascii="Times New Roman" w:hAnsi="Times New Roman" w:cs="Times New Roman"/>
+          <w:lang w:val="en-ID"/>
+        </w:rPr>
+        <w:br/>
+      </w:r>
+      <w:r>
+        <w:rPr>
+          <w:rFonts w:ascii="Times New Roman" w:hAnsi="Times New Roman" w:cs="Times New Roman"/>
+          <w:lang w:val="en-ID"/>
+        </w:rPr>
+        <w:t xml:space="preserve">PXE boot berada pada VM </w:t>
+      </w:r>
+      <w:r>
+        <w:rPr>
+          <w:rFonts w:ascii="Times New Roman" w:hAnsi="Times New Roman" w:cs="Times New Roman"/>
+          <w:b/>
+          <w:bCs/>
+          <w:lang w:val="en-ID"/>
+        </w:rPr>
+        <w:t>backend</w:t>
+      </w:r>
+      <w:r>
+        <w:rPr>
+          <w:rFonts w:ascii="Times New Roman" w:hAnsi="Times New Roman" w:cs="Times New Roman"/>
+          <w:lang w:val="en-ID"/>
+        </w:rPr>
+        <w:t xml:space="preserve">. Fitur ini merupakan mekanisme </w:t>
+      </w:r>
+      <w:r>
+        <w:rPr>
+          <w:rFonts w:ascii="Times New Roman" w:hAnsi="Times New Roman" w:cs="Times New Roman"/>
+          <w:i/>
+          <w:iCs/>
+          <w:lang w:val="en-ID"/>
+        </w:rPr>
+        <w:t>firmware</w:t>
+      </w:r>
+      <w:r>
+        <w:rPr>
+          <w:rFonts w:ascii="Times New Roman" w:hAnsi="Times New Roman" w:cs="Times New Roman"/>
+          <w:lang w:val="en-ID"/>
+        </w:rPr>
+        <w:t xml:space="preserve"> pada sisi klien (backend) yang memungkinkannya untuk melakukan </w:t>
+      </w:r>
+      <w:r>
+        <w:rPr>
+          <w:rFonts w:ascii="Times New Roman" w:hAnsi="Times New Roman" w:cs="Times New Roman"/>
+          <w:i/>
+          <w:iCs/>
+          <w:lang w:val="en-ID"/>
+        </w:rPr>
+        <w:t>booting</w:t>
+      </w:r>
+      <w:r>
+        <w:rPr>
+          <w:rFonts w:ascii="Times New Roman" w:hAnsi="Times New Roman" w:cs="Times New Roman"/>
+          <w:lang w:val="en-ID"/>
+        </w:rPr>
+        <w:t xml:space="preserve"> langsung dari jaringan tanpa memerlukan sistem operasi yang terinstal di hard disk lokalnya.</w:t>
+      </w:r>
+    </w:p>
+    <w:p>
+      <w:pPr>
+        <w:pStyle w:val="ListParagraph"/>
+        <w:rPr>
+          <w:rFonts w:ascii="Times New Roman" w:hAnsi="Times New Roman" w:cs="Times New Roman"/>
+        </w:rPr>
+      </w:pPr>
     </w:p>
     <w:sectPr>
       <w:pgSz w:w="12240" w:h="15840"/>
@@ -1486,8 +1779,8 @@
   <w:abstractNum w:abstractNumId="4" w15:restartNumberingAfterBreak="0">
     <w:nsid w:val="342F21AD"/>
     <w:multiLevelType w:val="hybridMultilevel"/>
-    <w:tmpl w:val="98684310"/>
-    <w:lvl w:ilvl="0" w:tplc="3809000F">
+    <w:tmpl w:val="E8DA8700"/>
+    <w:lvl w:ilvl="0" w:tplc="A324376E">
       <w:start w:val="1"/>
       <w:numFmt w:val="decimal"/>
       <w:lvlText w:val="%1."/>
@@ -1497,6 +1790,8 @@
       </w:pPr>
       <w:rPr>
         <w:rFonts w:hint="default"/>
+        <w:b/>
+        <w:bCs/>
       </w:rPr>
     </w:lvl>
     <w:lvl w:ilvl="1" w:tplc="38090019" w:tentative="1">

</xml_diff>